<commit_message>
fix: MST digit boxes now visible in PDF - patch wps:wsp solidFill to noFill + inject jinja tags into txbxContent
- patch_all_templates.py: comprehensive patcher for both modern wps:wsp shapes and legacy v:rect VML shapes
  * Remove white solidFill (FFFFFF) from mc:Choice wps shapes -> noFill (transparent)
  * Inject {{ mst_group_idx }} Jinja2 tags inside wps:txbx/w:txbxContent and v:textbox/w:txbxContent
  * Patch all 5 affected docx templates (2f2f, 5de8, 7c42, 93c4, b741)
- forms.py: sync auto-patch logic for newly uploaded templates with same approach
- frontend: UsersView, FormReviewModal, page.tsx, api.ts updates
- .gitignore: exclude test scripts, debug files, temp docx/pdf, logs from repo
</commit_message>
<xml_diff>
--- a/backend/data/templates/2f2f2509-d0fa-4ff3-b0be-6d743b5d9c96.docx
+++ b/backend/data/templates/2f2f2509-d0fa-4ff3-b0be-6d743b5d9c96.docx
@@ -988,9 +988,7 @@
                         <a:prstGeom prst="rect">
                           <a:avLst/>
                         </a:prstGeom>
-                        <a:solidFill>
-                          <a:srgbClr val="FFFFFF"/>
-                        </a:solidFill>
+                        <a:noFill/>
                         <a:ln w="9525">
                           <a:solidFill>
                             <a:srgbClr val="000000"/>
@@ -1002,7 +1000,19 @@
                       </wps:spPr>
                       <wps:txbx>
                         <w:txbxContent>
-                          <w:p/>
+                          <w:p>
+                            <w:pPr>
+                              <w:jc w:val="center"/>
+                              <w:spacing w:before="0" w:after="0"/>
+                            </w:pPr>
+                            <w:r>
+                              <w:rPr>
+                                <w:sz w:val="16"/>
+                                <w:szCs w:val="16"/>
+                              </w:rPr>
+                              <w:t>{{ mst_1_0 }}</w:t>
+                            </w:r>
+                          </w:p>
                         </w:txbxContent>
                       </wps:txbx>
                       <wps:bodyPr>
@@ -1022,19 +1032,20 @@
           </mc:Choice>
           <mc:Fallback>
             <w:pict>
-              <v:rect w14:anchorId="22B3DDA0" id="Rectangle 44" o:spid="_x0000_s1028" style="position:absolute;left:0;text-align:left;margin-left:258.1pt;margin-top:16.8pt;width:17.35pt;height:17.65pt;z-index:251667456;visibility:visible;mso-wrap-style:square;mso-width-percent:0;mso-height-percent:0;mso-wrap-distance-left:9pt;mso-wrap-distance-top:0;mso-wrap-distance-right:9pt;mso-wrap-distance-bottom:0;mso-position-horizontal:absolute;mso-position-horizontal-relative:text;mso-position-vertical:absolute;mso-position-vertical-relative:text;mso-width-percent:0;mso-height-percent:0;mso-width-relative:page;mso-height-relative:page;v-text-anchor:top" o:gfxdata="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">
+              <v:rect filled="f" w14:anchorId="22B3DDA0" id="Rectangle 44" o:spid="_x0000_s1028" style="position:absolute;left:0;text-align:left;margin-left:258.1pt;margin-top:16.8pt;width:17.35pt;height:17.65pt;z-index:251667456;visibility:visible;mso-wrap-style:square;mso-width-percent:0;mso-height-percent:0;mso-wrap-distance-left:9pt;mso-wrap-distance-top:0;mso-wrap-distance-right:9pt;mso-wrap-distance-bottom:0;mso-position-horizontal:absolute;mso-position-horizontal-relative:text;mso-position-vertical:absolute;mso-position-vertical-relative:text;mso-width-percent:0;mso-height-percent:0;mso-width-relative:page;mso-height-relative:page;v-text-anchor:top" o:gfxdata="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">
                 <v:textbox inset="0,0,0,0">
                   <w:txbxContent>
                     <w:p>
                       <w:pPr>
+                        <w:jc w:val="center"/>
                         <w:spacing w:before="0" w:after="0"/>
-                        <w:jc w:val="center"/>
                       </w:pPr>
                       <w:r>
                         <w:rPr>
-                          <w:sz w:val="20"/>
+                          <w:sz w:val="16"/>
+                          <w:szCs w:val="16"/>
                         </w:rPr>
-                        <w:t>{{ mst_1_0 }}</w:t>
+                        <w:t>{{ mst_3_0 }}</w:t>
                       </w:r>
                     </w:p>
                   </w:txbxContent>
@@ -1085,9 +1096,7 @@
                         <a:prstGeom prst="rect">
                           <a:avLst/>
                         </a:prstGeom>
-                        <a:solidFill>
-                          <a:srgbClr val="FFFFFF"/>
-                        </a:solidFill>
+                        <a:noFill/>
                         <a:ln w="9525">
                           <a:solidFill>
                             <a:srgbClr val="000000"/>
@@ -1099,7 +1108,19 @@
                       </wps:spPr>
                       <wps:txbx>
                         <w:txbxContent>
-                          <w:p/>
+                          <w:p>
+                            <w:pPr>
+                              <w:jc w:val="center"/>
+                              <w:spacing w:before="0" w:after="0"/>
+                            </w:pPr>
+                            <w:r>
+                              <w:rPr>
+                                <w:sz w:val="16"/>
+                                <w:szCs w:val="16"/>
+                              </w:rPr>
+                              <w:t>{{ mst_1_1 }}</w:t>
+                            </w:r>
+                          </w:p>
                         </w:txbxContent>
                       </wps:txbx>
                       <wps:bodyPr>
@@ -1119,19 +1140,20 @@
           </mc:Choice>
           <mc:Fallback>
             <w:pict>
-              <v:rect w14:anchorId="694A17A4" id="Rectangle 43" o:spid="_x0000_s1029" style="position:absolute;left:0;text-align:left;margin-left:240.5pt;margin-top:16.8pt;width:17.35pt;height:17.65pt;z-index:251666432;visibility:visible;mso-wrap-style:square;mso-width-percent:0;mso-height-percent:0;mso-wrap-distance-left:9pt;mso-wrap-distance-top:0;mso-wrap-distance-right:9pt;mso-wrap-distance-bottom:0;mso-position-horizontal:absolute;mso-position-horizontal-relative:text;mso-position-vertical:absolute;mso-position-vertical-relative:text;mso-width-percent:0;mso-height-percent:0;mso-width-relative:page;mso-height-relative:page;v-text-anchor:top" o:gfxdata="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">
+              <v:rect filled="f" w14:anchorId="694A17A4" id="Rectangle 43" o:spid="_x0000_s1029" style="position:absolute;left:0;text-align:left;margin-left:240.5pt;margin-top:16.8pt;width:17.35pt;height:17.65pt;z-index:251666432;visibility:visible;mso-wrap-style:square;mso-width-percent:0;mso-height-percent:0;mso-wrap-distance-left:9pt;mso-wrap-distance-top:0;mso-wrap-distance-right:9pt;mso-wrap-distance-bottom:0;mso-position-horizontal:absolute;mso-position-horizontal-relative:text;mso-position-vertical:absolute;mso-position-vertical-relative:text;mso-width-percent:0;mso-height-percent:0;mso-width-relative:page;mso-height-relative:page;v-text-anchor:top" o:gfxdata="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">
                 <v:textbox inset="0,0,0,0">
                   <w:txbxContent>
                     <w:p>
                       <w:pPr>
+                        <w:jc w:val="center"/>
                         <w:spacing w:before="0" w:after="0"/>
-                        <w:jc w:val="center"/>
                       </w:pPr>
                       <w:r>
                         <w:rPr>
-                          <w:sz w:val="20"/>
+                          <w:sz w:val="16"/>
+                          <w:szCs w:val="16"/>
                         </w:rPr>
-                        <w:t>{{ mst_1_1 }}</w:t>
+                        <w:t>{{ mst_3_1 }}</w:t>
                       </w:r>
                     </w:p>
                   </w:txbxContent>
@@ -1182,9 +1204,7 @@
                         <a:prstGeom prst="rect">
                           <a:avLst/>
                         </a:prstGeom>
-                        <a:solidFill>
-                          <a:srgbClr val="FFFFFF"/>
-                        </a:solidFill>
+                        <a:noFill/>
                         <a:ln w="9525">
                           <a:solidFill>
                             <a:srgbClr val="000000"/>
@@ -1196,7 +1216,19 @@
                       </wps:spPr>
                       <wps:txbx>
                         <w:txbxContent>
-                          <w:p/>
+                          <w:p>
+                            <w:pPr>
+                              <w:jc w:val="center"/>
+                              <w:spacing w:before="0" w:after="0"/>
+                            </w:pPr>
+                            <w:r>
+                              <w:rPr>
+                                <w:sz w:val="16"/>
+                                <w:szCs w:val="16"/>
+                              </w:rPr>
+                              <w:t>{{ mst_1_2 }}</w:t>
+                            </w:r>
+                          </w:p>
                         </w:txbxContent>
                       </wps:txbx>
                       <wps:bodyPr>
@@ -1216,19 +1248,20 @@
           </mc:Choice>
           <mc:Fallback>
             <w:pict>
-              <v:rect w14:anchorId="5A79EA95" id="Rectangle 42" o:spid="_x0000_s1030" style="position:absolute;left:0;text-align:left;margin-left:362.45pt;margin-top:16.8pt;width:17.35pt;height:17.7pt;z-index:251674624;visibility:visible;mso-wrap-style:square;mso-width-percent:0;mso-height-percent:0;mso-wrap-distance-left:9pt;mso-wrap-distance-top:0;mso-wrap-distance-right:9pt;mso-wrap-distance-bottom:0;mso-position-horizontal:absolute;mso-position-horizontal-relative:text;mso-position-vertical:absolute;mso-position-vertical-relative:text;mso-width-percent:0;mso-height-percent:0;mso-width-relative:page;mso-height-relative:page;v-text-anchor:top" o:gfxdata="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">
+              <v:rect filled="f" w14:anchorId="5A79EA95" id="Rectangle 42" o:spid="_x0000_s1030" style="position:absolute;left:0;text-align:left;margin-left:362.45pt;margin-top:16.8pt;width:17.35pt;height:17.7pt;z-index:251674624;visibility:visible;mso-wrap-style:square;mso-width-percent:0;mso-height-percent:0;mso-wrap-distance-left:9pt;mso-wrap-distance-top:0;mso-wrap-distance-right:9pt;mso-wrap-distance-bottom:0;mso-position-horizontal:absolute;mso-position-horizontal-relative:text;mso-position-vertical:absolute;mso-position-vertical-relative:text;mso-width-percent:0;mso-height-percent:0;mso-width-relative:page;mso-height-relative:page;v-text-anchor:top" o:gfxdata="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">
                 <v:textbox inset="0,0,0,0">
                   <w:txbxContent>
                     <w:p>
                       <w:pPr>
+                        <w:jc w:val="center"/>
                         <w:spacing w:before="0" w:after="0"/>
-                        <w:jc w:val="center"/>
                       </w:pPr>
                       <w:r>
                         <w:rPr>
-                          <w:sz w:val="20"/>
+                          <w:sz w:val="16"/>
+                          <w:szCs w:val="16"/>
                         </w:rPr>
-                        <w:t>{{ mst_1_2 }}</w:t>
+                        <w:t>{{ mst_3_2 }}</w:t>
                       </w:r>
                     </w:p>
                   </w:txbxContent>
@@ -1279,9 +1312,7 @@
                         <a:prstGeom prst="rect">
                           <a:avLst/>
                         </a:prstGeom>
-                        <a:solidFill>
-                          <a:srgbClr val="FFFFFF"/>
-                        </a:solidFill>
+                        <a:noFill/>
                         <a:ln w="9525">
                           <a:solidFill>
                             <a:srgbClr val="000000"/>
@@ -1293,7 +1324,19 @@
                       </wps:spPr>
                       <wps:txbx>
                         <w:txbxContent>
-                          <w:p/>
+                          <w:p>
+                            <w:pPr>
+                              <w:jc w:val="center"/>
+                              <w:spacing w:before="0" w:after="0"/>
+                            </w:pPr>
+                            <w:r>
+                              <w:rPr>
+                                <w:sz w:val="16"/>
+                                <w:szCs w:val="16"/>
+                              </w:rPr>
+                              <w:t>{{ mst_1_3 }}</w:t>
+                            </w:r>
+                          </w:p>
                         </w:txbxContent>
                       </wps:txbx>
                       <wps:bodyPr>
@@ -1313,19 +1356,20 @@
           </mc:Choice>
           <mc:Fallback>
             <w:pict>
-              <v:rect w14:anchorId="12294793" id="Rectangle 41" o:spid="_x0000_s1031" style="position:absolute;left:0;text-align:left;margin-left:345.1pt;margin-top:16.75pt;width:17.35pt;height:17.7pt;z-index:251673600;visibility:visible;mso-wrap-style:square;mso-width-percent:0;mso-height-percent:0;mso-wrap-distance-left:9pt;mso-wrap-distance-top:0;mso-wrap-distance-right:9pt;mso-wrap-distance-bottom:0;mso-position-horizontal:absolute;mso-position-horizontal-relative:text;mso-position-vertical:absolute;mso-position-vertical-relative:text;mso-width-percent:0;mso-height-percent:0;mso-width-relative:page;mso-height-relative:page;v-text-anchor:top" o:gfxdata="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">
+              <v:rect filled="f" w14:anchorId="12294793" id="Rectangle 41" o:spid="_x0000_s1031" style="position:absolute;left:0;text-align:left;margin-left:345.1pt;margin-top:16.75pt;width:17.35pt;height:17.7pt;z-index:251673600;visibility:visible;mso-wrap-style:square;mso-width-percent:0;mso-height-percent:0;mso-wrap-distance-left:9pt;mso-wrap-distance-top:0;mso-wrap-distance-right:9pt;mso-wrap-distance-bottom:0;mso-position-horizontal:absolute;mso-position-horizontal-relative:text;mso-position-vertical:absolute;mso-position-vertical-relative:text;mso-width-percent:0;mso-height-percent:0;mso-width-relative:page;mso-height-relative:page;v-text-anchor:top" o:gfxdata="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">
                 <v:textbox inset="0,0,0,0">
                   <w:txbxContent>
                     <w:p>
                       <w:pPr>
+                        <w:jc w:val="center"/>
                         <w:spacing w:before="0" w:after="0"/>
-                        <w:jc w:val="center"/>
                       </w:pPr>
                       <w:r>
                         <w:rPr>
-                          <w:sz w:val="20"/>
+                          <w:sz w:val="16"/>
+                          <w:szCs w:val="16"/>
                         </w:rPr>
-                        <w:t>{{ mst_1_3 }}</w:t>
+                        <w:t>{{ mst_3_3 }}</w:t>
                       </w:r>
                     </w:p>
                   </w:txbxContent>
@@ -1376,9 +1420,7 @@
                         <a:prstGeom prst="rect">
                           <a:avLst/>
                         </a:prstGeom>
-                        <a:solidFill>
-                          <a:srgbClr val="FFFFFF"/>
-                        </a:solidFill>
+                        <a:noFill/>
                         <a:ln w="9525">
                           <a:solidFill>
                             <a:srgbClr val="000000"/>
@@ -1390,7 +1432,19 @@
                       </wps:spPr>
                       <wps:txbx>
                         <w:txbxContent>
-                          <w:p/>
+                          <w:p>
+                            <w:pPr>
+                              <w:jc w:val="center"/>
+                              <w:spacing w:before="0" w:after="0"/>
+                            </w:pPr>
+                            <w:r>
+                              <w:rPr>
+                                <w:sz w:val="16"/>
+                                <w:szCs w:val="16"/>
+                              </w:rPr>
+                              <w:t>{{ mst_1_4 }}</w:t>
+                            </w:r>
+                          </w:p>
                         </w:txbxContent>
                       </wps:txbx>
                       <wps:bodyPr>
@@ -1410,19 +1464,20 @@
           </mc:Choice>
           <mc:Fallback>
             <w:pict>
-              <v:rect w14:anchorId="54AB8607" id="Rectangle 40" o:spid="_x0000_s1032" style="position:absolute;left:0;text-align:left;margin-left:327.75pt;margin-top:16.75pt;width:17.35pt;height:17.7pt;z-index:251672576;visibility:visible;mso-wrap-style:square;mso-width-percent:0;mso-height-percent:0;mso-wrap-distance-left:9pt;mso-wrap-distance-top:0;mso-wrap-distance-right:9pt;mso-wrap-distance-bottom:0;mso-position-horizontal:absolute;mso-position-horizontal-relative:text;mso-position-vertical:absolute;mso-position-vertical-relative:text;mso-width-percent:0;mso-height-percent:0;mso-width-relative:page;mso-height-relative:page;v-text-anchor:top" o:gfxdata="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">
+              <v:rect filled="f" w14:anchorId="54AB8607" id="Rectangle 40" o:spid="_x0000_s1032" style="position:absolute;left:0;text-align:left;margin-left:327.75pt;margin-top:16.75pt;width:17.35pt;height:17.7pt;z-index:251672576;visibility:visible;mso-wrap-style:square;mso-width-percent:0;mso-height-percent:0;mso-wrap-distance-left:9pt;mso-wrap-distance-top:0;mso-wrap-distance-right:9pt;mso-wrap-distance-bottom:0;mso-position-horizontal:absolute;mso-position-horizontal-relative:text;mso-position-vertical:absolute;mso-position-vertical-relative:text;mso-width-percent:0;mso-height-percent:0;mso-width-relative:page;mso-height-relative:page;v-text-anchor:top" o:gfxdata="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">
                 <v:textbox inset="0,0,0,0">
                   <w:txbxContent>
                     <w:p>
                       <w:pPr>
+                        <w:jc w:val="center"/>
                         <w:spacing w:before="0" w:after="0"/>
-                        <w:jc w:val="center"/>
                       </w:pPr>
                       <w:r>
                         <w:rPr>
-                          <w:sz w:val="20"/>
+                          <w:sz w:val="16"/>
+                          <w:szCs w:val="16"/>
                         </w:rPr>
-                        <w:t>{{ mst_1_4 }}</w:t>
+                        <w:t>{{ mst_3_4 }}</w:t>
                       </w:r>
                     </w:p>
                   </w:txbxContent>
@@ -1473,9 +1528,7 @@
                         <a:prstGeom prst="rect">
                           <a:avLst/>
                         </a:prstGeom>
-                        <a:solidFill>
-                          <a:srgbClr val="FFFFFF"/>
-                        </a:solidFill>
+                        <a:noFill/>
                         <a:ln w="9525">
                           <a:solidFill>
                             <a:srgbClr val="000000"/>
@@ -1487,7 +1540,19 @@
                       </wps:spPr>
                       <wps:txbx>
                         <w:txbxContent>
-                          <w:p/>
+                          <w:p>
+                            <w:pPr>
+                              <w:jc w:val="center"/>
+                              <w:spacing w:before="0" w:after="0"/>
+                            </w:pPr>
+                            <w:r>
+                              <w:rPr>
+                                <w:sz w:val="16"/>
+                                <w:szCs w:val="16"/>
+                              </w:rPr>
+                              <w:t>{{ mst_1_5 }}</w:t>
+                            </w:r>
+                          </w:p>
                         </w:txbxContent>
                       </wps:txbx>
                       <wps:bodyPr>
@@ -1507,19 +1572,20 @@
           </mc:Choice>
           <mc:Fallback>
             <w:pict>
-              <v:rect w14:anchorId="53419A27" id="Rectangle 39" o:spid="_x0000_s1033" style="position:absolute;left:0;text-align:left;margin-left:293.05pt;margin-top:16.75pt;width:17.35pt;height:17.7pt;z-index:251669504;visibility:visible;mso-wrap-style:square;mso-width-percent:0;mso-height-percent:0;mso-wrap-distance-left:9pt;mso-wrap-distance-top:0;mso-wrap-distance-right:9pt;mso-wrap-distance-bottom:0;mso-position-horizontal:absolute;mso-position-horizontal-relative:text;mso-position-vertical:absolute;mso-position-vertical-relative:text;mso-width-percent:0;mso-height-percent:0;mso-width-relative:page;mso-height-relative:page;v-text-anchor:top" o:gfxdata="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">
+              <v:rect filled="f" w14:anchorId="53419A27" id="Rectangle 39" o:spid="_x0000_s1033" style="position:absolute;left:0;text-align:left;margin-left:293.05pt;margin-top:16.75pt;width:17.35pt;height:17.7pt;z-index:251669504;visibility:visible;mso-wrap-style:square;mso-width-percent:0;mso-height-percent:0;mso-wrap-distance-left:9pt;mso-wrap-distance-top:0;mso-wrap-distance-right:9pt;mso-wrap-distance-bottom:0;mso-position-horizontal:absolute;mso-position-horizontal-relative:text;mso-position-vertical:absolute;mso-position-vertical-relative:text;mso-width-percent:0;mso-height-percent:0;mso-width-relative:page;mso-height-relative:page;v-text-anchor:top" o:gfxdata="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">
                 <v:textbox inset="0,0,0,0">
                   <w:txbxContent>
                     <w:p>
                       <w:pPr>
+                        <w:jc w:val="center"/>
                         <w:spacing w:before="0" w:after="0"/>
-                        <w:jc w:val="center"/>
                       </w:pPr>
                       <w:r>
                         <w:rPr>
-                          <w:sz w:val="20"/>
+                          <w:sz w:val="16"/>
+                          <w:szCs w:val="16"/>
                         </w:rPr>
-                        <w:t>{{ mst_1_5 }}</w:t>
+                        <w:t>{{ mst_3_5 }}</w:t>
                       </w:r>
                     </w:p>
                   </w:txbxContent>
@@ -1570,9 +1636,7 @@
                         <a:prstGeom prst="rect">
                           <a:avLst/>
                         </a:prstGeom>
-                        <a:solidFill>
-                          <a:srgbClr val="FFFFFF"/>
-                        </a:solidFill>
+                        <a:noFill/>
                         <a:ln w="9525">
                           <a:solidFill>
                             <a:srgbClr val="000000"/>
@@ -1584,7 +1648,19 @@
                       </wps:spPr>
                       <wps:txbx>
                         <w:txbxContent>
-                          <w:p/>
+                          <w:p>
+                            <w:pPr>
+                              <w:jc w:val="center"/>
+                              <w:spacing w:before="0" w:after="0"/>
+                            </w:pPr>
+                            <w:r>
+                              <w:rPr>
+                                <w:sz w:val="16"/>
+                                <w:szCs w:val="16"/>
+                              </w:rPr>
+                              <w:t>{{ mst_1_6 }}</w:t>
+                            </w:r>
+                          </w:p>
                         </w:txbxContent>
                       </wps:txbx>
                       <wps:bodyPr>
@@ -1604,19 +1680,20 @@
           </mc:Choice>
           <mc:Fallback>
             <w:pict>
-              <v:rect w14:anchorId="16C39B51" id="Rectangle 38" o:spid="_x0000_s1034" style="position:absolute;left:0;text-align:left;margin-left:275.45pt;margin-top:16.75pt;width:17.35pt;height:17.7pt;z-index:251668480;visibility:visible;mso-wrap-style:square;mso-width-percent:0;mso-height-percent:0;mso-wrap-distance-left:9pt;mso-wrap-distance-top:0;mso-wrap-distance-right:9pt;mso-wrap-distance-bottom:0;mso-position-horizontal:absolute;mso-position-horizontal-relative:text;mso-position-vertical:absolute;mso-position-vertical-relative:text;mso-width-percent:0;mso-height-percent:0;mso-width-relative:page;mso-height-relative:page;v-text-anchor:top" o:gfxdata="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">
+              <v:rect filled="f" w14:anchorId="16C39B51" id="Rectangle 38" o:spid="_x0000_s1034" style="position:absolute;left:0;text-align:left;margin-left:275.45pt;margin-top:16.75pt;width:17.35pt;height:17.7pt;z-index:251668480;visibility:visible;mso-wrap-style:square;mso-width-percent:0;mso-height-percent:0;mso-wrap-distance-left:9pt;mso-wrap-distance-top:0;mso-wrap-distance-right:9pt;mso-wrap-distance-bottom:0;mso-position-horizontal:absolute;mso-position-horizontal-relative:text;mso-position-vertical:absolute;mso-position-vertical-relative:text;mso-width-percent:0;mso-height-percent:0;mso-width-relative:page;mso-height-relative:page;v-text-anchor:top" o:gfxdata="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">
                 <v:textbox inset="0,0,0,0">
                   <w:txbxContent>
                     <w:p>
                       <w:pPr>
+                        <w:jc w:val="center"/>
                         <w:spacing w:before="0" w:after="0"/>
-                        <w:jc w:val="center"/>
                       </w:pPr>
                       <w:r>
                         <w:rPr>
-                          <w:sz w:val="20"/>
+                          <w:sz w:val="16"/>
+                          <w:szCs w:val="16"/>
                         </w:rPr>
-                        <w:t>{{ mst_1_6 }}</w:t>
+                        <w:t>{{ mst_3_6 }}</w:t>
                       </w:r>
                     </w:p>
                   </w:txbxContent>
@@ -1667,9 +1744,7 @@
                         <a:prstGeom prst="rect">
                           <a:avLst/>
                         </a:prstGeom>
-                        <a:solidFill>
-                          <a:srgbClr val="FFFFFF"/>
-                        </a:solidFill>
+                        <a:noFill/>
                         <a:ln w="9525">
                           <a:solidFill>
                             <a:srgbClr val="000000"/>
@@ -1681,7 +1756,19 @@
                       </wps:spPr>
                       <wps:txbx>
                         <w:txbxContent>
-                          <w:p/>
+                          <w:p>
+                            <w:pPr>
+                              <w:jc w:val="center"/>
+                              <w:spacing w:before="0" w:after="0"/>
+                            </w:pPr>
+                            <w:r>
+                              <w:rPr>
+                                <w:sz w:val="16"/>
+                                <w:szCs w:val="16"/>
+                              </w:rPr>
+                              <w:t>{{ mst_1_7 }}</w:t>
+                            </w:r>
+                          </w:p>
                         </w:txbxContent>
                       </wps:txbx>
                       <wps:bodyPr>
@@ -1701,19 +1788,20 @@
           </mc:Choice>
           <mc:Fallback>
             <w:pict>
-              <v:rect w14:anchorId="692A4166" id="Rectangle 37" o:spid="_x0000_s1035" style="position:absolute;left:0;text-align:left;margin-left:171.5pt;margin-top:16.75pt;width:17.35pt;height:17.7pt;z-index:251664384;visibility:visible;mso-wrap-style:square;mso-width-percent:0;mso-height-percent:0;mso-wrap-distance-left:9pt;mso-wrap-distance-top:0;mso-wrap-distance-right:9pt;mso-wrap-distance-bottom:0;mso-position-horizontal:absolute;mso-position-horizontal-relative:text;mso-position-vertical:absolute;mso-position-vertical-relative:text;mso-width-percent:0;mso-height-percent:0;mso-width-relative:page;mso-height-relative:page;v-text-anchor:top" o:gfxdata="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">
+              <v:rect filled="f" w14:anchorId="692A4166" id="Rectangle 37" o:spid="_x0000_s1035" style="position:absolute;left:0;text-align:left;margin-left:171.5pt;margin-top:16.75pt;width:17.35pt;height:17.7pt;z-index:251664384;visibility:visible;mso-wrap-style:square;mso-width-percent:0;mso-height-percent:0;mso-wrap-distance-left:9pt;mso-wrap-distance-top:0;mso-wrap-distance-right:9pt;mso-wrap-distance-bottom:0;mso-position-horizontal:absolute;mso-position-horizontal-relative:text;mso-position-vertical:absolute;mso-position-vertical-relative:text;mso-width-percent:0;mso-height-percent:0;mso-width-relative:page;mso-height-relative:page;v-text-anchor:top" o:gfxdata="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">
                 <v:textbox inset="0,0,0,0">
                   <w:txbxContent>
                     <w:p>
                       <w:pPr>
+                        <w:jc w:val="center"/>
                         <w:spacing w:before="0" w:after="0"/>
-                        <w:jc w:val="center"/>
                       </w:pPr>
                       <w:r>
                         <w:rPr>
-                          <w:sz w:val="20"/>
+                          <w:sz w:val="16"/>
+                          <w:szCs w:val="16"/>
                         </w:rPr>
-                        <w:t>{{ mst_1_7 }}</w:t>
+                        <w:t>{{ mst_3_7 }}</w:t>
                       </w:r>
                     </w:p>
                   </w:txbxContent>
@@ -1764,9 +1852,7 @@
                         <a:prstGeom prst="rect">
                           <a:avLst/>
                         </a:prstGeom>
-                        <a:solidFill>
-                          <a:srgbClr val="FFFFFF"/>
-                        </a:solidFill>
+                        <a:noFill/>
                         <a:ln w="9525">
                           <a:solidFill>
                             <a:srgbClr val="000000"/>
@@ -1778,7 +1864,19 @@
                       </wps:spPr>
                       <wps:txbx>
                         <w:txbxContent>
-                          <w:p/>
+                          <w:p>
+                            <w:pPr>
+                              <w:jc w:val="center"/>
+                              <w:spacing w:before="0" w:after="0"/>
+                            </w:pPr>
+                            <w:r>
+                              <w:rPr>
+                                <w:sz w:val="16"/>
+                                <w:szCs w:val="16"/>
+                              </w:rPr>
+                              <w:t>{{ mst_1_8 }}</w:t>
+                            </w:r>
+                          </w:p>
                         </w:txbxContent>
                       </wps:txbx>
                       <wps:bodyPr>
@@ -1798,19 +1896,20 @@
           </mc:Choice>
           <mc:Fallback>
             <w:pict>
-              <v:rect w14:anchorId="151BD121" id="Rectangle 36" o:spid="_x0000_s1036" style="position:absolute;left:0;text-align:left;margin-left:189.1pt;margin-top:16.75pt;width:17.35pt;height:17.7pt;z-index:251665408;visibility:visible;mso-wrap-style:square;mso-width-percent:0;mso-height-percent:0;mso-wrap-distance-left:9pt;mso-wrap-distance-top:0;mso-wrap-distance-right:9pt;mso-wrap-distance-bottom:0;mso-position-horizontal:absolute;mso-position-horizontal-relative:text;mso-position-vertical:absolute;mso-position-vertical-relative:text;mso-width-percent:0;mso-height-percent:0;mso-width-relative:page;mso-height-relative:page;v-text-anchor:top" o:gfxdata="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">
+              <v:rect filled="f" w14:anchorId="151BD121" id="Rectangle 36" o:spid="_x0000_s1036" style="position:absolute;left:0;text-align:left;margin-left:189.1pt;margin-top:16.75pt;width:17.35pt;height:17.7pt;z-index:251665408;visibility:visible;mso-wrap-style:square;mso-width-percent:0;mso-height-percent:0;mso-wrap-distance-left:9pt;mso-wrap-distance-top:0;mso-wrap-distance-right:9pt;mso-wrap-distance-bottom:0;mso-position-horizontal:absolute;mso-position-horizontal-relative:text;mso-position-vertical:absolute;mso-position-vertical-relative:text;mso-width-percent:0;mso-height-percent:0;mso-width-relative:page;mso-height-relative:page;v-text-anchor:top" o:gfxdata="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">
                 <v:textbox inset="0,0,0,0">
                   <w:txbxContent>
                     <w:p>
                       <w:pPr>
+                        <w:jc w:val="center"/>
                         <w:spacing w:before="0" w:after="0"/>
-                        <w:jc w:val="center"/>
                       </w:pPr>
                       <w:r>
                         <w:rPr>
-                          <w:sz w:val="20"/>
+                          <w:sz w:val="16"/>
+                          <w:szCs w:val="16"/>
                         </w:rPr>
-                        <w:t>{{ mst_1_8 }}</w:t>
+                        <w:t>{{ mst_3_8 }}</w:t>
                       </w:r>
                     </w:p>
                   </w:txbxContent>
@@ -1861,9 +1960,7 @@
                         <a:prstGeom prst="rect">
                           <a:avLst/>
                         </a:prstGeom>
-                        <a:solidFill>
-                          <a:srgbClr val="FFFFFF"/>
-                        </a:solidFill>
+                        <a:noFill/>
                         <a:ln w="9525">
                           <a:solidFill>
                             <a:srgbClr val="000000"/>
@@ -1875,7 +1972,19 @@
                       </wps:spPr>
                       <wps:txbx>
                         <w:txbxContent>
-                          <w:p/>
+                          <w:p>
+                            <w:pPr>
+                              <w:jc w:val="center"/>
+                              <w:spacing w:before="0" w:after="0"/>
+                            </w:pPr>
+                            <w:r>
+                              <w:rPr>
+                                <w:sz w:val="16"/>
+                                <w:szCs w:val="16"/>
+                              </w:rPr>
+                              <w:t>{{ mst_1_9 }}</w:t>
+                            </w:r>
+                          </w:p>
                         </w:txbxContent>
                       </wps:txbx>
                       <wps:bodyPr>
@@ -1895,19 +2004,20 @@
           </mc:Choice>
           <mc:Fallback>
             <w:pict>
-              <v:rect w14:anchorId="6732A81E" id="Rectangle 35" o:spid="_x0000_s1037" style="position:absolute;left:0;text-align:left;margin-left:223.6pt;margin-top:16.75pt;width:17.35pt;height:17.7pt;z-index:251671552;visibility:visible;mso-wrap-style:square;mso-width-percent:0;mso-height-percent:0;mso-wrap-distance-left:9pt;mso-wrap-distance-top:0;mso-wrap-distance-right:9pt;mso-wrap-distance-bottom:0;mso-position-horizontal:absolute;mso-position-horizontal-relative:text;mso-position-vertical:absolute;mso-position-vertical-relative:text;mso-width-percent:0;mso-height-percent:0;mso-width-relative:page;mso-height-relative:page;v-text-anchor:top" o:gfxdata="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">
+              <v:rect filled="f" w14:anchorId="6732A81E" id="Rectangle 35" o:spid="_x0000_s1037" style="position:absolute;left:0;text-align:left;margin-left:223.6pt;margin-top:16.75pt;width:17.35pt;height:17.7pt;z-index:251671552;visibility:visible;mso-wrap-style:square;mso-width-percent:0;mso-height-percent:0;mso-wrap-distance-left:9pt;mso-wrap-distance-top:0;mso-wrap-distance-right:9pt;mso-wrap-distance-bottom:0;mso-position-horizontal:absolute;mso-position-horizontal-relative:text;mso-position-vertical:absolute;mso-position-vertical-relative:text;mso-width-percent:0;mso-height-percent:0;mso-width-relative:page;mso-height-relative:page;v-text-anchor:top" o:gfxdata="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">
                 <v:textbox inset="0,0,0,0">
                   <w:txbxContent>
                     <w:p>
                       <w:pPr>
+                        <w:jc w:val="center"/>
                         <w:spacing w:before="0" w:after="0"/>
-                        <w:jc w:val="center"/>
                       </w:pPr>
                       <w:r>
                         <w:rPr>
-                          <w:sz w:val="20"/>
+                          <w:sz w:val="16"/>
+                          <w:szCs w:val="16"/>
                         </w:rPr>
-                        <w:t>{{ mst_1_9 }}</w:t>
+                        <w:t>{{ mst_3_9 }}</w:t>
                       </w:r>
                     </w:p>
                   </w:txbxContent>
@@ -1958,9 +2068,7 @@
                         <a:prstGeom prst="rect">
                           <a:avLst/>
                         </a:prstGeom>
-                        <a:solidFill>
-                          <a:srgbClr val="FFFFFF"/>
-                        </a:solidFill>
+                        <a:noFill/>
                         <a:ln w="9525">
                           <a:solidFill>
                             <a:srgbClr val="000000"/>
@@ -1972,7 +2080,19 @@
                       </wps:spPr>
                       <wps:txbx>
                         <w:txbxContent>
-                          <w:p/>
+                          <w:p>
+                            <w:pPr>
+                              <w:jc w:val="center"/>
+                              <w:spacing w:before="0" w:after="0"/>
+                            </w:pPr>
+                            <w:r>
+                              <w:rPr>
+                                <w:sz w:val="16"/>
+                                <w:szCs w:val="16"/>
+                              </w:rPr>
+                              <w:t>{{ mst_1_10 }}</w:t>
+                            </w:r>
+                          </w:p>
                         </w:txbxContent>
                       </wps:txbx>
                       <wps:bodyPr>
@@ -1992,19 +2112,20 @@
           </mc:Choice>
           <mc:Fallback>
             <w:pict>
-              <v:rect w14:anchorId="1D686B88" id="Rectangle 34" o:spid="_x0000_s1038" style="position:absolute;left:0;text-align:left;margin-left:206pt;margin-top:16.75pt;width:17.35pt;height:17.7pt;z-index:251670528;visibility:visible;mso-wrap-style:square;mso-width-percent:0;mso-height-percent:0;mso-wrap-distance-left:9pt;mso-wrap-distance-top:0;mso-wrap-distance-right:9pt;mso-wrap-distance-bottom:0;mso-position-horizontal:absolute;mso-position-horizontal-relative:text;mso-position-vertical:absolute;mso-position-vertical-relative:text;mso-width-percent:0;mso-height-percent:0;mso-width-relative:page;mso-height-relative:page;v-text-anchor:top" o:gfxdata="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">
+              <v:rect filled="f" w14:anchorId="1D686B88" id="Rectangle 34" o:spid="_x0000_s1038" style="position:absolute;left:0;text-align:left;margin-left:206pt;margin-top:16.75pt;width:17.35pt;height:17.7pt;z-index:251670528;visibility:visible;mso-wrap-style:square;mso-width-percent:0;mso-height-percent:0;mso-wrap-distance-left:9pt;mso-wrap-distance-top:0;mso-wrap-distance-right:9pt;mso-wrap-distance-bottom:0;mso-position-horizontal:absolute;mso-position-horizontal-relative:text;mso-position-vertical:absolute;mso-position-vertical-relative:text;mso-width-percent:0;mso-height-percent:0;mso-width-relative:page;mso-height-relative:page;v-text-anchor:top" o:gfxdata="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">
                 <v:textbox inset="0,0,0,0">
                   <w:txbxContent>
                     <w:p>
                       <w:pPr>
+                        <w:jc w:val="center"/>
                         <w:spacing w:before="0" w:after="0"/>
-                        <w:jc w:val="center"/>
                       </w:pPr>
                       <w:r>
                         <w:rPr>
-                          <w:sz w:val="20"/>
+                          <w:sz w:val="16"/>
+                          <w:szCs w:val="16"/>
                         </w:rPr>
-                        <w:t>{{ mst_1_10 }}</w:t>
+                        <w:t>{{ mst_3_10 }}</w:t>
                       </w:r>
                     </w:p>
                   </w:txbxContent>
@@ -2055,9 +2176,7 @@
                         <a:prstGeom prst="rect">
                           <a:avLst/>
                         </a:prstGeom>
-                        <a:solidFill>
-                          <a:srgbClr val="FFFFFF"/>
-                        </a:solidFill>
+                        <a:noFill/>
                         <a:ln w="9525">
                           <a:solidFill>
                             <a:srgbClr val="000000"/>
@@ -2069,7 +2188,19 @@
                       </wps:spPr>
                       <wps:txbx>
                         <w:txbxContent>
-                          <w:p/>
+                          <w:p>
+                            <w:pPr>
+                              <w:jc w:val="center"/>
+                              <w:spacing w:before="0" w:after="0"/>
+                            </w:pPr>
+                            <w:r>
+                              <w:rPr>
+                                <w:sz w:val="16"/>
+                                <w:szCs w:val="16"/>
+                              </w:rPr>
+                              <w:t>{{ mst_1_11 }}</w:t>
+                            </w:r>
+                          </w:p>
                         </w:txbxContent>
                       </wps:txbx>
                       <wps:bodyPr>
@@ -2089,19 +2220,20 @@
           </mc:Choice>
           <mc:Fallback>
             <w:pict>
-              <v:rect w14:anchorId="49F1F1B5" id="Rectangle 33" o:spid="_x0000_s1039" style="position:absolute;left:0;text-align:left;margin-left:154.3pt;margin-top:16.8pt;width:17.35pt;height:17.65pt;z-index:251663360;visibility:visible;mso-wrap-style:square;mso-width-percent:0;mso-height-percent:0;mso-wrap-distance-left:9pt;mso-wrap-distance-top:0;mso-wrap-distance-right:9pt;mso-wrap-distance-bottom:0;mso-position-horizontal:absolute;mso-position-horizontal-relative:text;mso-position-vertical:absolute;mso-position-vertical-relative:text;mso-width-percent:0;mso-height-percent:0;mso-width-relative:page;mso-height-relative:page;v-text-anchor:top" o:gfxdata="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">
+              <v:rect filled="f" w14:anchorId="49F1F1B5" id="Rectangle 33" o:spid="_x0000_s1039" style="position:absolute;left:0;text-align:left;margin-left:154.3pt;margin-top:16.8pt;width:17.35pt;height:17.65pt;z-index:251663360;visibility:visible;mso-wrap-style:square;mso-width-percent:0;mso-height-percent:0;mso-wrap-distance-left:9pt;mso-wrap-distance-top:0;mso-wrap-distance-right:9pt;mso-wrap-distance-bottom:0;mso-position-horizontal:absolute;mso-position-horizontal-relative:text;mso-position-vertical:absolute;mso-position-vertical-relative:text;mso-width-percent:0;mso-height-percent:0;mso-width-relative:page;mso-height-relative:page;v-text-anchor:top" o:gfxdata="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">
                 <v:textbox inset="0,0,0,0">
                   <w:txbxContent>
                     <w:p>
                       <w:pPr>
+                        <w:jc w:val="center"/>
                         <w:spacing w:before="0" w:after="0"/>
-                        <w:jc w:val="center"/>
                       </w:pPr>
                       <w:r>
                         <w:rPr>
-                          <w:sz w:val="20"/>
+                          <w:sz w:val="16"/>
+                          <w:szCs w:val="16"/>
                         </w:rPr>
-                        <w:t>{{ mst_1_11 }}</w:t>
+                        <w:t>{{ mst_3_11 }}</w:t>
                       </w:r>
                     </w:p>
                   </w:txbxContent>
@@ -2152,9 +2284,7 @@
                         <a:prstGeom prst="rect">
                           <a:avLst/>
                         </a:prstGeom>
-                        <a:solidFill>
-                          <a:srgbClr val="FFFFFF"/>
-                        </a:solidFill>
+                        <a:noFill/>
                         <a:ln w="9525">
                           <a:solidFill>
                             <a:srgbClr val="000000"/>
@@ -2166,7 +2296,19 @@
                       </wps:spPr>
                       <wps:txbx>
                         <w:txbxContent>
-                          <w:p/>
+                          <w:p>
+                            <w:pPr>
+                              <w:jc w:val="center"/>
+                              <w:spacing w:before="0" w:after="0"/>
+                            </w:pPr>
+                            <w:r>
+                              <w:rPr>
+                                <w:sz w:val="16"/>
+                                <w:szCs w:val="16"/>
+                              </w:rPr>
+                              <w:t>{{ mst_1_12 }}</w:t>
+                            </w:r>
+                          </w:p>
                         </w:txbxContent>
                       </wps:txbx>
                       <wps:bodyPr>
@@ -2186,19 +2328,20 @@
           </mc:Choice>
           <mc:Fallback>
             <w:pict>
-              <v:rect w14:anchorId="61D29A86" id="Rectangle 32" o:spid="_x0000_s1040" style="position:absolute;left:0;text-align:left;margin-left:136.7pt;margin-top:16.8pt;width:17.35pt;height:17.65pt;z-index:251662336;visibility:visible;mso-wrap-style:square;mso-width-percent:0;mso-height-percent:0;mso-wrap-distance-left:9pt;mso-wrap-distance-top:0;mso-wrap-distance-right:9pt;mso-wrap-distance-bottom:0;mso-position-horizontal:absolute;mso-position-horizontal-relative:text;mso-position-vertical:absolute;mso-position-vertical-relative:text;mso-width-percent:0;mso-height-percent:0;mso-width-relative:page;mso-height-relative:page;v-text-anchor:top" o:gfxdata="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">
+              <v:rect filled="f" w14:anchorId="61D29A86" id="Rectangle 32" o:spid="_x0000_s1040" style="position:absolute;left:0;text-align:left;margin-left:136.7pt;margin-top:16.8pt;width:17.35pt;height:17.65pt;z-index:251662336;visibility:visible;mso-wrap-style:square;mso-width-percent:0;mso-height-percent:0;mso-wrap-distance-left:9pt;mso-wrap-distance-top:0;mso-wrap-distance-right:9pt;mso-wrap-distance-bottom:0;mso-position-horizontal:absolute;mso-position-horizontal-relative:text;mso-position-vertical:absolute;mso-position-vertical-relative:text;mso-width-percent:0;mso-height-percent:0;mso-width-relative:page;mso-height-relative:page;v-text-anchor:top" o:gfxdata="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">
                 <v:textbox inset="0,0,0,0">
                   <w:txbxContent>
                     <w:p>
                       <w:pPr>
+                        <w:jc w:val="center"/>
                         <w:spacing w:before="0" w:after="0"/>
-                        <w:jc w:val="center"/>
                       </w:pPr>
                       <w:r>
                         <w:rPr>
-                          <w:sz w:val="20"/>
+                          <w:sz w:val="16"/>
+                          <w:szCs w:val="16"/>
                         </w:rPr>
-                        <w:t>{{ mst_1_12 }}</w:t>
+                        <w:t>{{ mst_3_12 }}</w:t>
                       </w:r>
                     </w:p>
                   </w:txbxContent>
@@ -2823,9 +2966,7 @@
                         <a:prstGeom prst="rect">
                           <a:avLst/>
                         </a:prstGeom>
-                        <a:solidFill>
-                          <a:srgbClr val="FFFFFF"/>
-                        </a:solidFill>
+                        <a:noFill/>
                         <a:ln w="9525">
                           <a:solidFill>
                             <a:srgbClr val="000000"/>
@@ -2837,7 +2978,19 @@
                       </wps:spPr>
                       <wps:txbx>
                         <w:txbxContent>
-                          <w:p/>
+                          <w:p>
+                            <w:pPr>
+                              <w:jc w:val="center"/>
+                              <w:spacing w:before="0" w:after="0"/>
+                            </w:pPr>
+                            <w:r>
+                              <w:rPr>
+                                <w:sz w:val="16"/>
+                                <w:szCs w:val="16"/>
+                              </w:rPr>
+                              <w:t>{{ mst_2_0 }}</w:t>
+                            </w:r>
+                          </w:p>
                         </w:txbxContent>
                       </wps:txbx>
                       <wps:bodyPr>
@@ -2857,19 +3010,20 @@
           </mc:Choice>
           <mc:Fallback>
             <w:pict>
-              <v:rect w14:anchorId="677EE47D" id="Rectangle 27" o:spid="_x0000_s1041" style="position:absolute;left:0;text-align:left;margin-left:258.1pt;margin-top:16.8pt;width:17.35pt;height:17.65pt;z-index:251680768;visibility:visible;mso-wrap-style:square;mso-width-percent:0;mso-height-percent:0;mso-wrap-distance-left:9pt;mso-wrap-distance-top:0;mso-wrap-distance-right:9pt;mso-wrap-distance-bottom:0;mso-position-horizontal:absolute;mso-position-horizontal-relative:text;mso-position-vertical:absolute;mso-position-vertical-relative:text;mso-width-percent:0;mso-height-percent:0;mso-width-relative:page;mso-height-relative:page;v-text-anchor:top" o:gfxdata="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">
+              <v:rect filled="f" w14:anchorId="677EE47D" id="Rectangle 27" o:spid="_x0000_s1041" style="position:absolute;left:0;text-align:left;margin-left:258.1pt;margin-top:16.8pt;width:17.35pt;height:17.65pt;z-index:251680768;visibility:visible;mso-wrap-style:square;mso-width-percent:0;mso-height-percent:0;mso-wrap-distance-left:9pt;mso-wrap-distance-top:0;mso-wrap-distance-right:9pt;mso-wrap-distance-bottom:0;mso-position-horizontal:absolute;mso-position-horizontal-relative:text;mso-position-vertical:absolute;mso-position-vertical-relative:text;mso-width-percent:0;mso-height-percent:0;mso-width-relative:page;mso-height-relative:page;v-text-anchor:top" o:gfxdata="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">
                 <v:textbox inset="0,0,0,0">
                   <w:txbxContent>
                     <w:p>
                       <w:pPr>
+                        <w:jc w:val="center"/>
                         <w:spacing w:before="0" w:after="0"/>
-                        <w:jc w:val="center"/>
                       </w:pPr>
                       <w:r>
                         <w:rPr>
-                          <w:sz w:val="20"/>
+                          <w:sz w:val="16"/>
+                          <w:szCs w:val="16"/>
                         </w:rPr>
-                        <w:t>{{ mst_2_0 }}</w:t>
+                        <w:t>{{ mst_4_0 }}</w:t>
                       </w:r>
                     </w:p>
                   </w:txbxContent>
@@ -2920,9 +3074,7 @@
                         <a:prstGeom prst="rect">
                           <a:avLst/>
                         </a:prstGeom>
-                        <a:solidFill>
-                          <a:srgbClr val="FFFFFF"/>
-                        </a:solidFill>
+                        <a:noFill/>
                         <a:ln w="9525">
                           <a:solidFill>
                             <a:srgbClr val="000000"/>
@@ -2934,7 +3086,19 @@
                       </wps:spPr>
                       <wps:txbx>
                         <w:txbxContent>
-                          <w:p/>
+                          <w:p>
+                            <w:pPr>
+                              <w:jc w:val="center"/>
+                              <w:spacing w:before="0" w:after="0"/>
+                            </w:pPr>
+                            <w:r>
+                              <w:rPr>
+                                <w:sz w:val="16"/>
+                                <w:szCs w:val="16"/>
+                              </w:rPr>
+                              <w:t>{{ mst_2_1 }}</w:t>
+                            </w:r>
+                          </w:p>
                         </w:txbxContent>
                       </wps:txbx>
                       <wps:bodyPr>
@@ -2954,19 +3118,20 @@
           </mc:Choice>
           <mc:Fallback>
             <w:pict>
-              <v:rect w14:anchorId="0A107923" id="Rectangle 26" o:spid="_x0000_s1042" style="position:absolute;left:0;text-align:left;margin-left:240.5pt;margin-top:16.8pt;width:17.35pt;height:17.65pt;z-index:251679744;visibility:visible;mso-wrap-style:square;mso-width-percent:0;mso-height-percent:0;mso-wrap-distance-left:9pt;mso-wrap-distance-top:0;mso-wrap-distance-right:9pt;mso-wrap-distance-bottom:0;mso-position-horizontal:absolute;mso-position-horizontal-relative:text;mso-position-vertical:absolute;mso-position-vertical-relative:text;mso-width-percent:0;mso-height-percent:0;mso-width-relative:page;mso-height-relative:page;v-text-anchor:top" o:gfxdata="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">
+              <v:rect filled="f" w14:anchorId="0A107923" id="Rectangle 26" o:spid="_x0000_s1042" style="position:absolute;left:0;text-align:left;margin-left:240.5pt;margin-top:16.8pt;width:17.35pt;height:17.65pt;z-index:251679744;visibility:visible;mso-wrap-style:square;mso-width-percent:0;mso-height-percent:0;mso-wrap-distance-left:9pt;mso-wrap-distance-top:0;mso-wrap-distance-right:9pt;mso-wrap-distance-bottom:0;mso-position-horizontal:absolute;mso-position-horizontal-relative:text;mso-position-vertical:absolute;mso-position-vertical-relative:text;mso-width-percent:0;mso-height-percent:0;mso-width-relative:page;mso-height-relative:page;v-text-anchor:top" o:gfxdata="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">
                 <v:textbox inset="0,0,0,0">
                   <w:txbxContent>
                     <w:p>
                       <w:pPr>
+                        <w:jc w:val="center"/>
                         <w:spacing w:before="0" w:after="0"/>
-                        <w:jc w:val="center"/>
                       </w:pPr>
                       <w:r>
                         <w:rPr>
-                          <w:sz w:val="20"/>
+                          <w:sz w:val="16"/>
+                          <w:szCs w:val="16"/>
                         </w:rPr>
-                        <w:t>{{ mst_2_1 }}</w:t>
+                        <w:t>{{ mst_4_1 }}</w:t>
                       </w:r>
                     </w:p>
                   </w:txbxContent>
@@ -3017,9 +3182,7 @@
                         <a:prstGeom prst="rect">
                           <a:avLst/>
                         </a:prstGeom>
-                        <a:solidFill>
-                          <a:srgbClr val="FFFFFF"/>
-                        </a:solidFill>
+                        <a:noFill/>
                         <a:ln w="9525">
                           <a:solidFill>
                             <a:srgbClr val="000000"/>
@@ -3031,7 +3194,19 @@
                       </wps:spPr>
                       <wps:txbx>
                         <w:txbxContent>
-                          <w:p/>
+                          <w:p>
+                            <w:pPr>
+                              <w:jc w:val="center"/>
+                              <w:spacing w:before="0" w:after="0"/>
+                            </w:pPr>
+                            <w:r>
+                              <w:rPr>
+                                <w:sz w:val="16"/>
+                                <w:szCs w:val="16"/>
+                              </w:rPr>
+                              <w:t>{{ mst_2_2 }}</w:t>
+                            </w:r>
+                          </w:p>
                         </w:txbxContent>
                       </wps:txbx>
                       <wps:bodyPr>
@@ -3051,19 +3226,20 @@
           </mc:Choice>
           <mc:Fallback>
             <w:pict>
-              <v:rect w14:anchorId="3503F281" id="Rectangle 19" o:spid="_x0000_s1043" style="position:absolute;left:0;text-align:left;margin-left:362.45pt;margin-top:16.8pt;width:17.35pt;height:17.7pt;z-index:251687936;visibility:visible;mso-wrap-style:square;mso-width-percent:0;mso-height-percent:0;mso-wrap-distance-left:9pt;mso-wrap-distance-top:0;mso-wrap-distance-right:9pt;mso-wrap-distance-bottom:0;mso-position-horizontal:absolute;mso-position-horizontal-relative:text;mso-position-vertical:absolute;mso-position-vertical-relative:text;mso-width-percent:0;mso-height-percent:0;mso-width-relative:page;mso-height-relative:page;v-text-anchor:top" o:gfxdata="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">
+              <v:rect filled="f" w14:anchorId="3503F281" id="Rectangle 19" o:spid="_x0000_s1043" style="position:absolute;left:0;text-align:left;margin-left:362.45pt;margin-top:16.8pt;width:17.35pt;height:17.7pt;z-index:251687936;visibility:visible;mso-wrap-style:square;mso-width-percent:0;mso-height-percent:0;mso-wrap-distance-left:9pt;mso-wrap-distance-top:0;mso-wrap-distance-right:9pt;mso-wrap-distance-bottom:0;mso-position-horizontal:absolute;mso-position-horizontal-relative:text;mso-position-vertical:absolute;mso-position-vertical-relative:text;mso-width-percent:0;mso-height-percent:0;mso-width-relative:page;mso-height-relative:page;v-text-anchor:top" o:gfxdata="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">
                 <v:textbox inset="0,0,0,0">
                   <w:txbxContent>
                     <w:p>
                       <w:pPr>
+                        <w:jc w:val="center"/>
                         <w:spacing w:before="0" w:after="0"/>
-                        <w:jc w:val="center"/>
                       </w:pPr>
                       <w:r>
                         <w:rPr>
-                          <w:sz w:val="20"/>
+                          <w:sz w:val="16"/>
+                          <w:szCs w:val="16"/>
                         </w:rPr>
-                        <w:t>{{ mst_2_2 }}</w:t>
+                        <w:t>{{ mst_4_2 }}</w:t>
                       </w:r>
                     </w:p>
                   </w:txbxContent>
@@ -3114,9 +3290,7 @@
                         <a:prstGeom prst="rect">
                           <a:avLst/>
                         </a:prstGeom>
-                        <a:solidFill>
-                          <a:srgbClr val="FFFFFF"/>
-                        </a:solidFill>
+                        <a:noFill/>
                         <a:ln w="9525">
                           <a:solidFill>
                             <a:srgbClr val="000000"/>
@@ -3128,7 +3302,19 @@
                       </wps:spPr>
                       <wps:txbx>
                         <w:txbxContent>
-                          <w:p/>
+                          <w:p>
+                            <w:pPr>
+                              <w:jc w:val="center"/>
+                              <w:spacing w:before="0" w:after="0"/>
+                            </w:pPr>
+                            <w:r>
+                              <w:rPr>
+                                <w:sz w:val="16"/>
+                                <w:szCs w:val="16"/>
+                              </w:rPr>
+                              <w:t>{{ mst_2_3 }}</w:t>
+                            </w:r>
+                          </w:p>
                         </w:txbxContent>
                       </wps:txbx>
                       <wps:bodyPr>
@@ -3148,19 +3334,20 @@
           </mc:Choice>
           <mc:Fallback>
             <w:pict>
-              <v:rect w14:anchorId="737B20F1" id="Rectangle 18" o:spid="_x0000_s1044" style="position:absolute;left:0;text-align:left;margin-left:345.1pt;margin-top:16.75pt;width:17.35pt;height:17.7pt;z-index:251686912;visibility:visible;mso-wrap-style:square;mso-width-percent:0;mso-height-percent:0;mso-wrap-distance-left:9pt;mso-wrap-distance-top:0;mso-wrap-distance-right:9pt;mso-wrap-distance-bottom:0;mso-position-horizontal:absolute;mso-position-horizontal-relative:text;mso-position-vertical:absolute;mso-position-vertical-relative:text;mso-width-percent:0;mso-height-percent:0;mso-width-relative:page;mso-height-relative:page;v-text-anchor:top" o:gfxdata="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">
+              <v:rect filled="f" w14:anchorId="737B20F1" id="Rectangle 18" o:spid="_x0000_s1044" style="position:absolute;left:0;text-align:left;margin-left:345.1pt;margin-top:16.75pt;width:17.35pt;height:17.7pt;z-index:251686912;visibility:visible;mso-wrap-style:square;mso-width-percent:0;mso-height-percent:0;mso-wrap-distance-left:9pt;mso-wrap-distance-top:0;mso-wrap-distance-right:9pt;mso-wrap-distance-bottom:0;mso-position-horizontal:absolute;mso-position-horizontal-relative:text;mso-position-vertical:absolute;mso-position-vertical-relative:text;mso-width-percent:0;mso-height-percent:0;mso-width-relative:page;mso-height-relative:page;v-text-anchor:top" o:gfxdata="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">
                 <v:textbox inset="0,0,0,0">
                   <w:txbxContent>
                     <w:p>
                       <w:pPr>
+                        <w:jc w:val="center"/>
                         <w:spacing w:before="0" w:after="0"/>
-                        <w:jc w:val="center"/>
                       </w:pPr>
                       <w:r>
                         <w:rPr>
-                          <w:sz w:val="20"/>
+                          <w:sz w:val="16"/>
+                          <w:szCs w:val="16"/>
                         </w:rPr>
-                        <w:t>{{ mst_2_3 }}</w:t>
+                        <w:t>{{ mst_4_3 }}</w:t>
                       </w:r>
                     </w:p>
                   </w:txbxContent>
@@ -3211,9 +3398,7 @@
                         <a:prstGeom prst="rect">
                           <a:avLst/>
                         </a:prstGeom>
-                        <a:solidFill>
-                          <a:srgbClr val="FFFFFF"/>
-                        </a:solidFill>
+                        <a:noFill/>
                         <a:ln w="9525">
                           <a:solidFill>
                             <a:srgbClr val="000000"/>
@@ -3225,7 +3410,19 @@
                       </wps:spPr>
                       <wps:txbx>
                         <w:txbxContent>
-                          <w:p/>
+                          <w:p>
+                            <w:pPr>
+                              <w:jc w:val="center"/>
+                              <w:spacing w:before="0" w:after="0"/>
+                            </w:pPr>
+                            <w:r>
+                              <w:rPr>
+                                <w:sz w:val="16"/>
+                                <w:szCs w:val="16"/>
+                              </w:rPr>
+                              <w:t>{{ mst_2_4 }}</w:t>
+                            </w:r>
+                          </w:p>
                         </w:txbxContent>
                       </wps:txbx>
                       <wps:bodyPr>
@@ -3245,19 +3442,20 @@
           </mc:Choice>
           <mc:Fallback>
             <w:pict>
-              <v:rect w14:anchorId="55ABB4D6" id="Rectangle 17" o:spid="_x0000_s1045" style="position:absolute;left:0;text-align:left;margin-left:327.75pt;margin-top:16.75pt;width:17.35pt;height:17.7pt;z-index:251685888;visibility:visible;mso-wrap-style:square;mso-width-percent:0;mso-height-percent:0;mso-wrap-distance-left:9pt;mso-wrap-distance-top:0;mso-wrap-distance-right:9pt;mso-wrap-distance-bottom:0;mso-position-horizontal:absolute;mso-position-horizontal-relative:text;mso-position-vertical:absolute;mso-position-vertical-relative:text;mso-width-percent:0;mso-height-percent:0;mso-width-relative:page;mso-height-relative:page;v-text-anchor:top" o:gfxdata="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">
+              <v:rect filled="f" w14:anchorId="55ABB4D6" id="Rectangle 17" o:spid="_x0000_s1045" style="position:absolute;left:0;text-align:left;margin-left:327.75pt;margin-top:16.75pt;width:17.35pt;height:17.7pt;z-index:251685888;visibility:visible;mso-wrap-style:square;mso-width-percent:0;mso-height-percent:0;mso-wrap-distance-left:9pt;mso-wrap-distance-top:0;mso-wrap-distance-right:9pt;mso-wrap-distance-bottom:0;mso-position-horizontal:absolute;mso-position-horizontal-relative:text;mso-position-vertical:absolute;mso-position-vertical-relative:text;mso-width-percent:0;mso-height-percent:0;mso-width-relative:page;mso-height-relative:page;v-text-anchor:top" o:gfxdata="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">
                 <v:textbox inset="0,0,0,0">
                   <w:txbxContent>
                     <w:p>
                       <w:pPr>
+                        <w:jc w:val="center"/>
                         <w:spacing w:before="0" w:after="0"/>
-                        <w:jc w:val="center"/>
                       </w:pPr>
                       <w:r>
                         <w:rPr>
-                          <w:sz w:val="20"/>
+                          <w:sz w:val="16"/>
+                          <w:szCs w:val="16"/>
                         </w:rPr>
-                        <w:t>{{ mst_2_4 }}</w:t>
+                        <w:t>{{ mst_4_4 }}</w:t>
                       </w:r>
                     </w:p>
                   </w:txbxContent>
@@ -3308,9 +3506,7 @@
                         <a:prstGeom prst="rect">
                           <a:avLst/>
                         </a:prstGeom>
-                        <a:solidFill>
-                          <a:srgbClr val="FFFFFF"/>
-                        </a:solidFill>
+                        <a:noFill/>
                         <a:ln w="9525">
                           <a:solidFill>
                             <a:srgbClr val="000000"/>
@@ -3322,7 +3518,19 @@
                       </wps:spPr>
                       <wps:txbx>
                         <w:txbxContent>
-                          <w:p/>
+                          <w:p>
+                            <w:pPr>
+                              <w:jc w:val="center"/>
+                              <w:spacing w:before="0" w:after="0"/>
+                            </w:pPr>
+                            <w:r>
+                              <w:rPr>
+                                <w:sz w:val="16"/>
+                                <w:szCs w:val="16"/>
+                              </w:rPr>
+                              <w:t>{{ mst_2_5 }}</w:t>
+                            </w:r>
+                          </w:p>
                         </w:txbxContent>
                       </wps:txbx>
                       <wps:bodyPr>
@@ -3342,19 +3550,20 @@
           </mc:Choice>
           <mc:Fallback>
             <w:pict>
-              <v:rect w14:anchorId="3745562D" id="Rectangle 16" o:spid="_x0000_s1046" style="position:absolute;left:0;text-align:left;margin-left:293.05pt;margin-top:16.75pt;width:17.35pt;height:17.7pt;z-index:251682816;visibility:visible;mso-wrap-style:square;mso-width-percent:0;mso-height-percent:0;mso-wrap-distance-left:9pt;mso-wrap-distance-top:0;mso-wrap-distance-right:9pt;mso-wrap-distance-bottom:0;mso-position-horizontal:absolute;mso-position-horizontal-relative:text;mso-position-vertical:absolute;mso-position-vertical-relative:text;mso-width-percent:0;mso-height-percent:0;mso-width-relative:page;mso-height-relative:page;v-text-anchor:top" o:gfxdata="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">
+              <v:rect filled="f" w14:anchorId="3745562D" id="Rectangle 16" o:spid="_x0000_s1046" style="position:absolute;left:0;text-align:left;margin-left:293.05pt;margin-top:16.75pt;width:17.35pt;height:17.7pt;z-index:251682816;visibility:visible;mso-wrap-style:square;mso-width-percent:0;mso-height-percent:0;mso-wrap-distance-left:9pt;mso-wrap-distance-top:0;mso-wrap-distance-right:9pt;mso-wrap-distance-bottom:0;mso-position-horizontal:absolute;mso-position-horizontal-relative:text;mso-position-vertical:absolute;mso-position-vertical-relative:text;mso-width-percent:0;mso-height-percent:0;mso-width-relative:page;mso-height-relative:page;v-text-anchor:top" o:gfxdata="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">
                 <v:textbox inset="0,0,0,0">
                   <w:txbxContent>
                     <w:p>
                       <w:pPr>
+                        <w:jc w:val="center"/>
                         <w:spacing w:before="0" w:after="0"/>
-                        <w:jc w:val="center"/>
                       </w:pPr>
                       <w:r>
                         <w:rPr>
-                          <w:sz w:val="20"/>
+                          <w:sz w:val="16"/>
+                          <w:szCs w:val="16"/>
                         </w:rPr>
-                        <w:t>{{ mst_2_5 }}</w:t>
+                        <w:t>{{ mst_4_5 }}</w:t>
                       </w:r>
                     </w:p>
                   </w:txbxContent>
@@ -3405,9 +3614,7 @@
                         <a:prstGeom prst="rect">
                           <a:avLst/>
                         </a:prstGeom>
-                        <a:solidFill>
-                          <a:srgbClr val="FFFFFF"/>
-                        </a:solidFill>
+                        <a:noFill/>
                         <a:ln w="9525">
                           <a:solidFill>
                             <a:srgbClr val="000000"/>
@@ -3419,7 +3626,19 @@
                       </wps:spPr>
                       <wps:txbx>
                         <w:txbxContent>
-                          <w:p/>
+                          <w:p>
+                            <w:pPr>
+                              <w:jc w:val="center"/>
+                              <w:spacing w:before="0" w:after="0"/>
+                            </w:pPr>
+                            <w:r>
+                              <w:rPr>
+                                <w:sz w:val="16"/>
+                                <w:szCs w:val="16"/>
+                              </w:rPr>
+                              <w:t>{{ mst_2_6 }}</w:t>
+                            </w:r>
+                          </w:p>
                         </w:txbxContent>
                       </wps:txbx>
                       <wps:bodyPr>
@@ -3439,19 +3658,20 @@
           </mc:Choice>
           <mc:Fallback>
             <w:pict>
-              <v:rect w14:anchorId="7A07CD6B" id="Rectangle 15" o:spid="_x0000_s1047" style="position:absolute;left:0;text-align:left;margin-left:275.45pt;margin-top:16.75pt;width:17.35pt;height:17.7pt;z-index:251681792;visibility:visible;mso-wrap-style:square;mso-width-percent:0;mso-height-percent:0;mso-wrap-distance-left:9pt;mso-wrap-distance-top:0;mso-wrap-distance-right:9pt;mso-wrap-distance-bottom:0;mso-position-horizontal:absolute;mso-position-horizontal-relative:text;mso-position-vertical:absolute;mso-position-vertical-relative:text;mso-width-percent:0;mso-height-percent:0;mso-width-relative:page;mso-height-relative:page;v-text-anchor:top" o:gfxdata="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">
+              <v:rect filled="f" w14:anchorId="7A07CD6B" id="Rectangle 15" o:spid="_x0000_s1047" style="position:absolute;left:0;text-align:left;margin-left:275.45pt;margin-top:16.75pt;width:17.35pt;height:17.7pt;z-index:251681792;visibility:visible;mso-wrap-style:square;mso-width-percent:0;mso-height-percent:0;mso-wrap-distance-left:9pt;mso-wrap-distance-top:0;mso-wrap-distance-right:9pt;mso-wrap-distance-bottom:0;mso-position-horizontal:absolute;mso-position-horizontal-relative:text;mso-position-vertical:absolute;mso-position-vertical-relative:text;mso-width-percent:0;mso-height-percent:0;mso-width-relative:page;mso-height-relative:page;v-text-anchor:top" o:gfxdata="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">
                 <v:textbox inset="0,0,0,0">
                   <w:txbxContent>
                     <w:p>
                       <w:pPr>
+                        <w:jc w:val="center"/>
                         <w:spacing w:before="0" w:after="0"/>
-                        <w:jc w:val="center"/>
                       </w:pPr>
                       <w:r>
                         <w:rPr>
-                          <w:sz w:val="20"/>
+                          <w:sz w:val="16"/>
+                          <w:szCs w:val="16"/>
                         </w:rPr>
-                        <w:t>{{ mst_2_6 }}</w:t>
+                        <w:t>{{ mst_4_6 }}</w:t>
                       </w:r>
                     </w:p>
                   </w:txbxContent>
@@ -3502,9 +3722,7 @@
                         <a:prstGeom prst="rect">
                           <a:avLst/>
                         </a:prstGeom>
-                        <a:solidFill>
-                          <a:srgbClr val="FFFFFF"/>
-                        </a:solidFill>
+                        <a:noFill/>
                         <a:ln w="9525">
                           <a:solidFill>
                             <a:srgbClr val="000000"/>
@@ -3516,7 +3734,19 @@
                       </wps:spPr>
                       <wps:txbx>
                         <w:txbxContent>
-                          <w:p/>
+                          <w:p>
+                            <w:pPr>
+                              <w:jc w:val="center"/>
+                              <w:spacing w:before="0" w:after="0"/>
+                            </w:pPr>
+                            <w:r>
+                              <w:rPr>
+                                <w:sz w:val="16"/>
+                                <w:szCs w:val="16"/>
+                              </w:rPr>
+                              <w:t>{{ mst_2_7 }}</w:t>
+                            </w:r>
+                          </w:p>
                         </w:txbxContent>
                       </wps:txbx>
                       <wps:bodyPr>
@@ -3536,19 +3766,20 @@
           </mc:Choice>
           <mc:Fallback>
             <w:pict>
-              <v:rect w14:anchorId="1860703E" id="Rectangle 14" o:spid="_x0000_s1048" style="position:absolute;left:0;text-align:left;margin-left:171.5pt;margin-top:16.75pt;width:17.35pt;height:17.7pt;z-index:251677696;visibility:visible;mso-wrap-style:square;mso-width-percent:0;mso-height-percent:0;mso-wrap-distance-left:9pt;mso-wrap-distance-top:0;mso-wrap-distance-right:9pt;mso-wrap-distance-bottom:0;mso-position-horizontal:absolute;mso-position-horizontal-relative:text;mso-position-vertical:absolute;mso-position-vertical-relative:text;mso-width-percent:0;mso-height-percent:0;mso-width-relative:page;mso-height-relative:page;v-text-anchor:top" o:gfxdata="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">
+              <v:rect filled="f" w14:anchorId="1860703E" id="Rectangle 14" o:spid="_x0000_s1048" style="position:absolute;left:0;text-align:left;margin-left:171.5pt;margin-top:16.75pt;width:17.35pt;height:17.7pt;z-index:251677696;visibility:visible;mso-wrap-style:square;mso-width-percent:0;mso-height-percent:0;mso-wrap-distance-left:9pt;mso-wrap-distance-top:0;mso-wrap-distance-right:9pt;mso-wrap-distance-bottom:0;mso-position-horizontal:absolute;mso-position-horizontal-relative:text;mso-position-vertical:absolute;mso-position-vertical-relative:text;mso-width-percent:0;mso-height-percent:0;mso-width-relative:page;mso-height-relative:page;v-text-anchor:top" o:gfxdata="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">
                 <v:textbox inset="0,0,0,0">
                   <w:txbxContent>
                     <w:p>
                       <w:pPr>
+                        <w:jc w:val="center"/>
                         <w:spacing w:before="0" w:after="0"/>
-                        <w:jc w:val="center"/>
                       </w:pPr>
                       <w:r>
                         <w:rPr>
-                          <w:sz w:val="20"/>
+                          <w:sz w:val="16"/>
+                          <w:szCs w:val="16"/>
                         </w:rPr>
-                        <w:t>{{ mst_2_7 }}</w:t>
+                        <w:t>{{ mst_4_7 }}</w:t>
                       </w:r>
                     </w:p>
                   </w:txbxContent>
@@ -3599,9 +3830,7 @@
                         <a:prstGeom prst="rect">
                           <a:avLst/>
                         </a:prstGeom>
-                        <a:solidFill>
-                          <a:srgbClr val="FFFFFF"/>
-                        </a:solidFill>
+                        <a:noFill/>
                         <a:ln w="9525">
                           <a:solidFill>
                             <a:srgbClr val="000000"/>
@@ -3613,7 +3842,19 @@
                       </wps:spPr>
                       <wps:txbx>
                         <w:txbxContent>
-                          <w:p/>
+                          <w:p>
+                            <w:pPr>
+                              <w:jc w:val="center"/>
+                              <w:spacing w:before="0" w:after="0"/>
+                            </w:pPr>
+                            <w:r>
+                              <w:rPr>
+                                <w:sz w:val="16"/>
+                                <w:szCs w:val="16"/>
+                              </w:rPr>
+                              <w:t>{{ mst_2_8 }}</w:t>
+                            </w:r>
+                          </w:p>
                         </w:txbxContent>
                       </wps:txbx>
                       <wps:bodyPr>
@@ -3633,19 +3874,20 @@
           </mc:Choice>
           <mc:Fallback>
             <w:pict>
-              <v:rect w14:anchorId="46BEC36E" id="Rectangle 12" o:spid="_x0000_s1049" style="position:absolute;left:0;text-align:left;margin-left:189.1pt;margin-top:16.75pt;width:17.35pt;height:17.7pt;z-index:251678720;visibility:visible;mso-wrap-style:square;mso-width-percent:0;mso-height-percent:0;mso-wrap-distance-left:9pt;mso-wrap-distance-top:0;mso-wrap-distance-right:9pt;mso-wrap-distance-bottom:0;mso-position-horizontal:absolute;mso-position-horizontal-relative:text;mso-position-vertical:absolute;mso-position-vertical-relative:text;mso-width-percent:0;mso-height-percent:0;mso-width-relative:page;mso-height-relative:page;v-text-anchor:top" o:gfxdata="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">
+              <v:rect filled="f" w14:anchorId="46BEC36E" id="Rectangle 12" o:spid="_x0000_s1049" style="position:absolute;left:0;text-align:left;margin-left:189.1pt;margin-top:16.75pt;width:17.35pt;height:17.7pt;z-index:251678720;visibility:visible;mso-wrap-style:square;mso-width-percent:0;mso-height-percent:0;mso-wrap-distance-left:9pt;mso-wrap-distance-top:0;mso-wrap-distance-right:9pt;mso-wrap-distance-bottom:0;mso-position-horizontal:absolute;mso-position-horizontal-relative:text;mso-position-vertical:absolute;mso-position-vertical-relative:text;mso-width-percent:0;mso-height-percent:0;mso-width-relative:page;mso-height-relative:page;v-text-anchor:top" o:gfxdata="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">
                 <v:textbox inset="0,0,0,0">
                   <w:txbxContent>
                     <w:p>
                       <w:pPr>
+                        <w:jc w:val="center"/>
                         <w:spacing w:before="0" w:after="0"/>
-                        <w:jc w:val="center"/>
                       </w:pPr>
                       <w:r>
                         <w:rPr>
-                          <w:sz w:val="20"/>
+                          <w:sz w:val="16"/>
+                          <w:szCs w:val="16"/>
                         </w:rPr>
-                        <w:t>{{ mst_2_8 }}</w:t>
+                        <w:t>{{ mst_4_8 }}</w:t>
                       </w:r>
                     </w:p>
                   </w:txbxContent>
@@ -3696,9 +3938,7 @@
                         <a:prstGeom prst="rect">
                           <a:avLst/>
                         </a:prstGeom>
-                        <a:solidFill>
-                          <a:srgbClr val="FFFFFF"/>
-                        </a:solidFill>
+                        <a:noFill/>
                         <a:ln w="9525">
                           <a:solidFill>
                             <a:srgbClr val="000000"/>
@@ -3710,7 +3950,19 @@
                       </wps:spPr>
                       <wps:txbx>
                         <w:txbxContent>
-                          <w:p/>
+                          <w:p>
+                            <w:pPr>
+                              <w:jc w:val="center"/>
+                              <w:spacing w:before="0" w:after="0"/>
+                            </w:pPr>
+                            <w:r>
+                              <w:rPr>
+                                <w:sz w:val="16"/>
+                                <w:szCs w:val="16"/>
+                              </w:rPr>
+                              <w:t>{{ mst_2_9 }}</w:t>
+                            </w:r>
+                          </w:p>
                         </w:txbxContent>
                       </wps:txbx>
                       <wps:bodyPr>
@@ -3730,19 +3982,20 @@
           </mc:Choice>
           <mc:Fallback>
             <w:pict>
-              <v:rect w14:anchorId="1F5C22B0" id="Rectangle 11" o:spid="_x0000_s1050" style="position:absolute;left:0;text-align:left;margin-left:223.6pt;margin-top:16.75pt;width:17.35pt;height:17.7pt;z-index:251684864;visibility:visible;mso-wrap-style:square;mso-width-percent:0;mso-height-percent:0;mso-wrap-distance-left:9pt;mso-wrap-distance-top:0;mso-wrap-distance-right:9pt;mso-wrap-distance-bottom:0;mso-position-horizontal:absolute;mso-position-horizontal-relative:text;mso-position-vertical:absolute;mso-position-vertical-relative:text;mso-width-percent:0;mso-height-percent:0;mso-width-relative:page;mso-height-relative:page;v-text-anchor:top" o:gfxdata="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">
+              <v:rect filled="f" w14:anchorId="1F5C22B0" id="Rectangle 11" o:spid="_x0000_s1050" style="position:absolute;left:0;text-align:left;margin-left:223.6pt;margin-top:16.75pt;width:17.35pt;height:17.7pt;z-index:251684864;visibility:visible;mso-wrap-style:square;mso-width-percent:0;mso-height-percent:0;mso-wrap-distance-left:9pt;mso-wrap-distance-top:0;mso-wrap-distance-right:9pt;mso-wrap-distance-bottom:0;mso-position-horizontal:absolute;mso-position-horizontal-relative:text;mso-position-vertical:absolute;mso-position-vertical-relative:text;mso-width-percent:0;mso-height-percent:0;mso-width-relative:page;mso-height-relative:page;v-text-anchor:top" o:gfxdata="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">
                 <v:textbox inset="0,0,0,0">
                   <w:txbxContent>
                     <w:p>
                       <w:pPr>
+                        <w:jc w:val="center"/>
                         <w:spacing w:before="0" w:after="0"/>
-                        <w:jc w:val="center"/>
                       </w:pPr>
                       <w:r>
                         <w:rPr>
-                          <w:sz w:val="20"/>
+                          <w:sz w:val="16"/>
+                          <w:szCs w:val="16"/>
                         </w:rPr>
-                        <w:t>{{ mst_2_9 }}</w:t>
+                        <w:t>{{ mst_4_9 }}</w:t>
                       </w:r>
                     </w:p>
                   </w:txbxContent>
@@ -3793,9 +4046,7 @@
                         <a:prstGeom prst="rect">
                           <a:avLst/>
                         </a:prstGeom>
-                        <a:solidFill>
-                          <a:srgbClr val="FFFFFF"/>
-                        </a:solidFill>
+                        <a:noFill/>
                         <a:ln w="9525">
                           <a:solidFill>
                             <a:srgbClr val="000000"/>
@@ -3807,7 +4058,19 @@
                       </wps:spPr>
                       <wps:txbx>
                         <w:txbxContent>
-                          <w:p/>
+                          <w:p>
+                            <w:pPr>
+                              <w:jc w:val="center"/>
+                              <w:spacing w:before="0" w:after="0"/>
+                            </w:pPr>
+                            <w:r>
+                              <w:rPr>
+                                <w:sz w:val="16"/>
+                                <w:szCs w:val="16"/>
+                              </w:rPr>
+                              <w:t>{{ mst_2_10 }}</w:t>
+                            </w:r>
+                          </w:p>
                         </w:txbxContent>
                       </wps:txbx>
                       <wps:bodyPr>
@@ -3827,19 +4090,20 @@
           </mc:Choice>
           <mc:Fallback>
             <w:pict>
-              <v:rect w14:anchorId="2CAB779B" id="Rectangle 10" o:spid="_x0000_s1051" style="position:absolute;left:0;text-align:left;margin-left:206pt;margin-top:16.75pt;width:17.35pt;height:17.7pt;z-index:251683840;visibility:visible;mso-wrap-style:square;mso-width-percent:0;mso-height-percent:0;mso-wrap-distance-left:9pt;mso-wrap-distance-top:0;mso-wrap-distance-right:9pt;mso-wrap-distance-bottom:0;mso-position-horizontal:absolute;mso-position-horizontal-relative:text;mso-position-vertical:absolute;mso-position-vertical-relative:text;mso-width-percent:0;mso-height-percent:0;mso-width-relative:page;mso-height-relative:page;v-text-anchor:top" o:gfxdata="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">
+              <v:rect filled="f" w14:anchorId="2CAB779B" id="Rectangle 10" o:spid="_x0000_s1051" style="position:absolute;left:0;text-align:left;margin-left:206pt;margin-top:16.75pt;width:17.35pt;height:17.7pt;z-index:251683840;visibility:visible;mso-wrap-style:square;mso-width-percent:0;mso-height-percent:0;mso-wrap-distance-left:9pt;mso-wrap-distance-top:0;mso-wrap-distance-right:9pt;mso-wrap-distance-bottom:0;mso-position-horizontal:absolute;mso-position-horizontal-relative:text;mso-position-vertical:absolute;mso-position-vertical-relative:text;mso-width-percent:0;mso-height-percent:0;mso-width-relative:page;mso-height-relative:page;v-text-anchor:top" o:gfxdata="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">
                 <v:textbox inset="0,0,0,0">
                   <w:txbxContent>
                     <w:p>
                       <w:pPr>
+                        <w:jc w:val="center"/>
                         <w:spacing w:before="0" w:after="0"/>
-                        <w:jc w:val="center"/>
                       </w:pPr>
                       <w:r>
                         <w:rPr>
-                          <w:sz w:val="20"/>
+                          <w:sz w:val="16"/>
+                          <w:szCs w:val="16"/>
                         </w:rPr>
-                        <w:t>{{ mst_2_10 }}</w:t>
+                        <w:t>{{ mst_4_10 }}</w:t>
                       </w:r>
                     </w:p>
                   </w:txbxContent>
@@ -3890,9 +4154,7 @@
                         <a:prstGeom prst="rect">
                           <a:avLst/>
                         </a:prstGeom>
-                        <a:solidFill>
-                          <a:srgbClr val="FFFFFF"/>
-                        </a:solidFill>
+                        <a:noFill/>
                         <a:ln w="9525">
                           <a:solidFill>
                             <a:srgbClr val="000000"/>
@@ -3904,7 +4166,19 @@
                       </wps:spPr>
                       <wps:txbx>
                         <w:txbxContent>
-                          <w:p/>
+                          <w:p>
+                            <w:pPr>
+                              <w:jc w:val="center"/>
+                              <w:spacing w:before="0" w:after="0"/>
+                            </w:pPr>
+                            <w:r>
+                              <w:rPr>
+                                <w:sz w:val="16"/>
+                                <w:szCs w:val="16"/>
+                              </w:rPr>
+                              <w:t>{{ mst_2_11 }}</w:t>
+                            </w:r>
+                          </w:p>
                         </w:txbxContent>
                       </wps:txbx>
                       <wps:bodyPr>
@@ -3924,19 +4198,20 @@
           </mc:Choice>
           <mc:Fallback>
             <w:pict>
-              <v:rect w14:anchorId="49183B97" id="Rectangle 9" o:spid="_x0000_s1052" style="position:absolute;left:0;text-align:left;margin-left:154.3pt;margin-top:16.8pt;width:17.35pt;height:17.65pt;z-index:251676672;visibility:visible;mso-wrap-style:square;mso-width-percent:0;mso-height-percent:0;mso-wrap-distance-left:9pt;mso-wrap-distance-top:0;mso-wrap-distance-right:9pt;mso-wrap-distance-bottom:0;mso-position-horizontal:absolute;mso-position-horizontal-relative:text;mso-position-vertical:absolute;mso-position-vertical-relative:text;mso-width-percent:0;mso-height-percent:0;mso-width-relative:page;mso-height-relative:page;v-text-anchor:top" o:gfxdata="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">
+              <v:rect filled="f" w14:anchorId="49183B97" id="Rectangle 9" o:spid="_x0000_s1052" style="position:absolute;left:0;text-align:left;margin-left:154.3pt;margin-top:16.8pt;width:17.35pt;height:17.65pt;z-index:251676672;visibility:visible;mso-wrap-style:square;mso-width-percent:0;mso-height-percent:0;mso-wrap-distance-left:9pt;mso-wrap-distance-top:0;mso-wrap-distance-right:9pt;mso-wrap-distance-bottom:0;mso-position-horizontal:absolute;mso-position-horizontal-relative:text;mso-position-vertical:absolute;mso-position-vertical-relative:text;mso-width-percent:0;mso-height-percent:0;mso-width-relative:page;mso-height-relative:page;v-text-anchor:top" o:gfxdata="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">
                 <v:textbox inset="0,0,0,0">
                   <w:txbxContent>
                     <w:p>
                       <w:pPr>
+                        <w:jc w:val="center"/>
                         <w:spacing w:before="0" w:after="0"/>
-                        <w:jc w:val="center"/>
                       </w:pPr>
                       <w:r>
                         <w:rPr>
-                          <w:sz w:val="20"/>
+                          <w:sz w:val="16"/>
+                          <w:szCs w:val="16"/>
                         </w:rPr>
-                        <w:t>{{ mst_2_11 }}</w:t>
+                        <w:t>{{ mst_4_11 }}</w:t>
                       </w:r>
                     </w:p>
                   </w:txbxContent>
@@ -3987,9 +4262,7 @@
                         <a:prstGeom prst="rect">
                           <a:avLst/>
                         </a:prstGeom>
-                        <a:solidFill>
-                          <a:srgbClr val="FFFFFF"/>
-                        </a:solidFill>
+                        <a:noFill/>
                         <a:ln w="9525">
                           <a:solidFill>
                             <a:srgbClr val="000000"/>
@@ -4001,7 +4274,19 @@
                       </wps:spPr>
                       <wps:txbx>
                         <w:txbxContent>
-                          <w:p/>
+                          <w:p>
+                            <w:pPr>
+                              <w:jc w:val="center"/>
+                              <w:spacing w:before="0" w:after="0"/>
+                            </w:pPr>
+                            <w:r>
+                              <w:rPr>
+                                <w:sz w:val="16"/>
+                                <w:szCs w:val="16"/>
+                              </w:rPr>
+                              <w:t>{{ mst_2_12 }}</w:t>
+                            </w:r>
+                          </w:p>
                         </w:txbxContent>
                       </wps:txbx>
                       <wps:bodyPr>
@@ -4021,19 +4306,20 @@
           </mc:Choice>
           <mc:Fallback>
             <w:pict>
-              <v:rect w14:anchorId="41B2F83B" id="Rectangle 8" o:spid="_x0000_s1053" style="position:absolute;left:0;text-align:left;margin-left:136.7pt;margin-top:16.8pt;width:17.35pt;height:17.65pt;z-index:251675648;visibility:visible;mso-wrap-style:square;mso-width-percent:0;mso-height-percent:0;mso-wrap-distance-left:9pt;mso-wrap-distance-top:0;mso-wrap-distance-right:9pt;mso-wrap-distance-bottom:0;mso-position-horizontal:absolute;mso-position-horizontal-relative:text;mso-position-vertical:absolute;mso-position-vertical-relative:text;mso-width-percent:0;mso-height-percent:0;mso-width-relative:page;mso-height-relative:page;v-text-anchor:top" o:gfxdata="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">
+              <v:rect filled="f" w14:anchorId="41B2F83B" id="Rectangle 8" o:spid="_x0000_s1053" style="position:absolute;left:0;text-align:left;margin-left:136.7pt;margin-top:16.8pt;width:17.35pt;height:17.65pt;z-index:251675648;visibility:visible;mso-wrap-style:square;mso-width-percent:0;mso-height-percent:0;mso-wrap-distance-left:9pt;mso-wrap-distance-top:0;mso-wrap-distance-right:9pt;mso-wrap-distance-bottom:0;mso-position-horizontal:absolute;mso-position-horizontal-relative:text;mso-position-vertical:absolute;mso-position-vertical-relative:text;mso-width-percent:0;mso-height-percent:0;mso-width-relative:page;mso-height-relative:page;v-text-anchor:top" o:gfxdata="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">
                 <v:textbox inset="0,0,0,0">
                   <w:txbxContent>
                     <w:p>
                       <w:pPr>
+                        <w:jc w:val="center"/>
                         <w:spacing w:before="0" w:after="0"/>
-                        <w:jc w:val="center"/>
                       </w:pPr>
                       <w:r>
                         <w:rPr>
-                          <w:sz w:val="20"/>
+                          <w:sz w:val="16"/>
+                          <w:szCs w:val="16"/>
                         </w:rPr>
-                        <w:t>{{ mst_2_12 }}</w:t>
+                        <w:t>{{ mst_4_12 }}</w:t>
                       </w:r>
                     </w:p>
                   </w:txbxContent>

</xml_diff>

<commit_message>
fix: checkbox shapes now transparent (noFill) so tick mark is visible; fix MST digit filling for all 6 groups
- patch_all_templates.py: also patch checkbox shapes (cx=144145, ~11.3pt) with noFill
  so the tick mark rendered in the text layer below is no longer covered
- forms.py prepare_render_payload: fill mst_N_I for groups 1,3,5 from ma_so_thue
  and groups 2,4,6 from mst_dai_ly/ma_so_thue_dai_ly_thue
- Re-patch all 5 affected docx templates with checkbox fix
</commit_message>
<xml_diff>
--- a/backend/data/templates/2f2f2509-d0fa-4ff3-b0be-6d743b5d9c96.docx
+++ b/backend/data/templates/2f2f2509-d0fa-4ff3-b0be-6d743b5d9c96.docx
@@ -5379,9 +5379,7 @@
                         <a:prstGeom prst="rect">
                           <a:avLst/>
                         </a:prstGeom>
-                        <a:solidFill>
-                          <a:srgbClr val="FFFFFF"/>
-                        </a:solidFill>
+                        <a:noFill/>
                         <a:ln w="9525">
                           <a:solidFill>
                             <a:srgbClr val="000000"/>
@@ -5413,7 +5411,7 @@
           </mc:Choice>
           <mc:Fallback>
             <w:pict>
-              <v:rect w14:anchorId="09E9CA40" id="Rectangle 7" o:spid="_x0000_s1054" style="position:absolute;left:0;text-align:left;margin-left:145.8pt;margin-top:2.7pt;width:11.35pt;height:11.35pt;z-index:251688960;visibility:visible;mso-wrap-style:square;mso-width-percent:0;mso-height-percent:0;mso-wrap-distance-left:9pt;mso-wrap-distance-top:0;mso-wrap-distance-right:9pt;mso-wrap-distance-bottom:0;mso-position-horizontal:absolute;mso-position-horizontal-relative:text;mso-position-vertical:absolute;mso-position-vertical-relative:text;mso-width-percent:0;mso-height-percent:0;mso-width-relative:page;mso-height-relative:page;v-text-anchor:top" o:gfxdata="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">
+              <v:rect filled="f" w14:anchorId="09E9CA40" id="Rectangle 7" o:spid="_x0000_s1054" style="position:absolute;left:0;text-align:left;margin-left:145.8pt;margin-top:2.7pt;width:11.35pt;height:11.35pt;z-index:251688960;visibility:visible;mso-wrap-style:square;mso-width-percent:0;mso-height-percent:0;mso-wrap-distance-left:9pt;mso-wrap-distance-top:0;mso-wrap-distance-right:9pt;mso-wrap-distance-bottom:0;mso-position-horizontal:absolute;mso-position-horizontal-relative:text;mso-position-vertical:absolute;mso-position-vertical-relative:text;mso-width-percent:0;mso-height-percent:0;mso-width-relative:page;mso-height-relative:page;v-text-anchor:top" o:gfxdata="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">
                 <v:textbox>
                   <w:txbxContent>
                     <w:p/>
@@ -5619,9 +5617,7 @@
                         <a:prstGeom prst="rect">
                           <a:avLst/>
                         </a:prstGeom>
-                        <a:solidFill>
-                          <a:srgbClr val="FFFFFF"/>
-                        </a:solidFill>
+                        <a:noFill/>
                         <a:ln w="9525">
                           <a:solidFill>
                             <a:srgbClr val="000000"/>
@@ -5653,7 +5649,7 @@
           </mc:Choice>
           <mc:Fallback>
             <w:pict>
-              <v:rect w14:anchorId="6900B26B" id="Rectangle 4" o:spid="_x0000_s1055" style="position:absolute;left:0;text-align:left;margin-left:160.3pt;margin-top:2.1pt;width:11.35pt;height:11.35pt;z-index:251691008;visibility:visible;mso-wrap-style:square;mso-width-percent:0;mso-height-percent:0;mso-wrap-distance-left:9pt;mso-wrap-distance-top:0;mso-wrap-distance-right:9pt;mso-wrap-distance-bottom:0;mso-position-horizontal:absolute;mso-position-horizontal-relative:text;mso-position-vertical:absolute;mso-position-vertical-relative:text;mso-width-percent:0;mso-height-percent:0;mso-width-relative:page;mso-height-relative:page;v-text-anchor:top" o:gfxdata="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">
+              <v:rect filled="f" w14:anchorId="6900B26B" id="Rectangle 4" o:spid="_x0000_s1055" style="position:absolute;left:0;text-align:left;margin-left:160.3pt;margin-top:2.1pt;width:11.35pt;height:11.35pt;z-index:251691008;visibility:visible;mso-wrap-style:square;mso-width-percent:0;mso-height-percent:0;mso-wrap-distance-left:9pt;mso-wrap-distance-top:0;mso-wrap-distance-right:9pt;mso-wrap-distance-bottom:0;mso-position-horizontal:absolute;mso-position-horizontal-relative:text;mso-position-vertical:absolute;mso-position-vertical-relative:text;mso-width-percent:0;mso-height-percent:0;mso-width-relative:page;mso-height-relative:page;v-text-anchor:top" o:gfxdata="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">
                 <v:textbox>
                   <w:txbxContent>
                     <w:p/>
@@ -6225,9 +6221,7 @@
                         <a:prstGeom prst="rect">
                           <a:avLst/>
                         </a:prstGeom>
-                        <a:solidFill>
-                          <a:srgbClr val="FFFFFF"/>
-                        </a:solidFill>
+                        <a:noFill/>
                         <a:ln w="9525">
                           <a:solidFill>
                             <a:srgbClr val="000000"/>
@@ -6259,7 +6253,7 @@
           </mc:Choice>
           <mc:Fallback>
             <w:pict>
-              <v:rect w14:anchorId="5AC9A369" id="Rectangle 3" o:spid="_x0000_s1056" style="position:absolute;left:0;text-align:left;margin-left:169.8pt;margin-top:2.15pt;width:11.35pt;height:11.35pt;z-index:251689984;visibility:visible;mso-wrap-style:square;mso-width-percent:0;mso-height-percent:0;mso-wrap-distance-left:9pt;mso-wrap-distance-top:0;mso-wrap-distance-right:9pt;mso-wrap-distance-bottom:0;mso-position-horizontal:absolute;mso-position-horizontal-relative:text;mso-position-vertical:absolute;mso-position-vertical-relative:text;mso-width-percent:0;mso-height-percent:0;mso-width-relative:page;mso-height-relative:page;v-text-anchor:top" o:gfxdata="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">
+              <v:rect filled="f" w14:anchorId="5AC9A369" id="Rectangle 3" o:spid="_x0000_s1056" style="position:absolute;left:0;text-align:left;margin-left:169.8pt;margin-top:2.15pt;width:11.35pt;height:11.35pt;z-index:251689984;visibility:visible;mso-wrap-style:square;mso-width-percent:0;mso-height-percent:0;mso-wrap-distance-left:9pt;mso-wrap-distance-top:0;mso-wrap-distance-right:9pt;mso-wrap-distance-bottom:0;mso-position-horizontal:absolute;mso-position-horizontal-relative:text;mso-position-vertical:absolute;mso-position-vertical-relative:text;mso-width-percent:0;mso-height-percent:0;mso-width-relative:page;mso-height-relative:page;v-text-anchor:top" o:gfxdata="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">
                 <v:textbox>
                   <w:txbxContent>
                     <w:p/>

</xml_diff>